<commit_message>
update table 2 metrics
</commit_message>
<xml_diff>
--- a/reseach paper/long paper/vlm3d_long_paper.docx
+++ b/reseach paper/long paper/vlm3d_long_paper.docx
@@ -3835,7 +3835,7 @@
                 <w:i w:val="0"/>
                 <w:sz w:val="16"/>
               </w:rPr>
-              <w:t>Air trapping</w:t>
+              <w:t>Consolidation</w:t>
             </w:r>
           </w:p>
         </w:tc>
@@ -4067,7 +4067,7 @@
                 <w:i w:val="0"/>
                 <w:sz w:val="16"/>
               </w:rPr>
-              <w:t>Pleural thickening</w:t>
+              <w:t>Interlobular septal thick.</w:t>
             </w:r>
           </w:p>
         </w:tc>
@@ -4298,7 +4298,7 @@
       <w:r>
         <w:drawing>
           <wp:inline xmlns:a="http://schemas.openxmlformats.org/drawingml/2006/main" xmlns:pic="http://schemas.openxmlformats.org/drawingml/2006/picture">
-            <wp:extent cx="5303520" cy="4230316"/>
+            <wp:extent cx="5303520" cy="4021350"/>
             <wp:docPr id="2" name="Picture 2"/>
             <wp:cNvGraphicFramePr>
               <a:graphicFrameLocks noChangeAspect="1"/>
@@ -4319,7 +4319,7 @@
                   <pic:spPr>
                     <a:xfrm>
                       <a:off x="0" y="0"/>
-                      <a:ext cx="5303520" cy="4230316"/>
+                      <a:ext cx="5303520" cy="4021350"/>
                     </a:xfrm>
                     <a:prstGeom prst="rect"/>
                   </pic:spPr>

</xml_diff>